<commit_message>
ADDED: RBAC for asset edit/delete and handle orphaned issues safely
</commit_message>
<xml_diff>
--- a/results and outputs.docx
+++ b/results and outputs.docx
@@ -1,14 +1,14 @@
 
 <file path=word/document.xml><?xml version="1.0" encoding="utf-8"?>
-<w:document xmlns:wpc="http://schemas.microsoft.com/office/word/2010/wordprocessingCanvas" xmlns:mc="http://schemas.openxmlformats.org/markup-compatibility/2006" xmlns:o="urn:schemas-microsoft-com:office:office" xmlns:r="http://schemas.openxmlformats.org/officeDocument/2006/relationships" xmlns:m="http://schemas.openxmlformats.org/officeDocument/2006/math" xmlns:v="urn:schemas-microsoft-com:vml" xmlns:wp14="http://schemas.microsoft.com/office/word/2010/wordprocessingDrawing" xmlns:wp="http://schemas.openxmlformats.org/drawingml/2006/wordprocessingDrawing" xmlns:w10="urn:schemas-microsoft-com:office:word" xmlns:w="http://schemas.openxmlformats.org/wordprocessingml/2006/main" xmlns:w14="http://schemas.microsoft.com/office/word/2010/wordml" xmlns:w15="http://schemas.microsoft.com/office/word/2012/wordml" xmlns:wpg="http://schemas.microsoft.com/office/word/2010/wordprocessingGroup" xmlns:wpi="http://schemas.microsoft.com/office/word/2010/wordprocessingInk" xmlns:wne="http://schemas.microsoft.com/office/word/2006/wordml" xmlns:wps="http://schemas.microsoft.com/office/word/2010/wordprocessingShape" mc:Ignorable="w14 w15 wp14">
+<w:document xmlns:wpc="http://schemas.microsoft.com/office/word/2010/wordprocessingCanvas" xmlns:cx="http://schemas.microsoft.com/office/drawing/2014/chartex" xmlns:cx1="http://schemas.microsoft.com/office/drawing/2015/9/8/chartex" xmlns:mc="http://schemas.openxmlformats.org/markup-compatibility/2006" xmlns:o="urn:schemas-microsoft-com:office:office" xmlns:r="http://schemas.openxmlformats.org/officeDocument/2006/relationships" xmlns:m="http://schemas.openxmlformats.org/officeDocument/2006/math" xmlns:v="urn:schemas-microsoft-com:vml" xmlns:wp14="http://schemas.microsoft.com/office/word/2010/wordprocessingDrawing" xmlns:wp="http://schemas.openxmlformats.org/drawingml/2006/wordprocessingDrawing" xmlns:w10="urn:schemas-microsoft-com:office:word" xmlns:w="http://schemas.openxmlformats.org/wordprocessingml/2006/main" xmlns:w14="http://schemas.microsoft.com/office/word/2010/wordml" xmlns:w15="http://schemas.microsoft.com/office/word/2012/wordml" xmlns:w16se="http://schemas.microsoft.com/office/word/2015/wordml/symex" xmlns:wpg="http://schemas.microsoft.com/office/word/2010/wordprocessingGroup" xmlns:wpi="http://schemas.microsoft.com/office/word/2010/wordprocessingInk" xmlns:wne="http://schemas.microsoft.com/office/word/2006/wordml" xmlns:wps="http://schemas.microsoft.com/office/word/2010/wordprocessingShape" mc:Ignorable="w14 w15 w16se wp14">
   <w:body>
     <w:p>
       <w:r>
         <w:drawing>
-          <wp:inline distT="0" distB="0" distL="0" distR="0" wp14:anchorId="5B630A23" wp14:editId="7B9C8AE6">
-            <wp:extent cx="5943600" cy="3340735"/>
-            <wp:effectExtent l="0" t="0" r="0" b="0"/>
-            <wp:docPr id="1" name="Picture 1"/>
+          <wp:inline distT="0" distB="0" distL="0" distR="0" wp14:anchorId="35EC6D33" wp14:editId="7728653E">
+            <wp:extent cx="5943600" cy="3367405"/>
+            <wp:effectExtent l="0" t="0" r="0" b="4445"/>
+            <wp:docPr id="2" name="Picture 2"/>
             <wp:cNvGraphicFramePr>
               <a:graphicFrameLocks xmlns:a="http://schemas.openxmlformats.org/drawingml/2006/main" noChangeAspect="1"/>
             </wp:cNvGraphicFramePr>
@@ -28,7 +28,7 @@
                   <pic:spPr>
                     <a:xfrm>
                       <a:off x="0" y="0"/>
-                      <a:ext cx="5943600" cy="3340735"/>
+                      <a:ext cx="5943600" cy="3367405"/>
                     </a:xfrm>
                     <a:prstGeom prst="rect">
                       <a:avLst/>
@@ -42,6 +42,46 @@
       </w:r>
       <w:bookmarkStart w:id="0" w:name="_GoBack"/>
       <w:bookmarkEnd w:id="0"/>
+      <w:r>
+        <w:rPr>
+          <w:noProof/>
+        </w:rPr>
+        <w:drawing>
+          <wp:inline distT="0" distB="0" distL="0" distR="0" wp14:anchorId="5B630A23" wp14:editId="7B9C8AE6">
+            <wp:extent cx="5943600" cy="3340735"/>
+            <wp:effectExtent l="0" t="0" r="0" b="0"/>
+            <wp:docPr id="1" name="Picture 1"/>
+            <wp:cNvGraphicFramePr>
+              <a:graphicFrameLocks xmlns:a="http://schemas.openxmlformats.org/drawingml/2006/main" noChangeAspect="1"/>
+            </wp:cNvGraphicFramePr>
+            <a:graphic xmlns:a="http://schemas.openxmlformats.org/drawingml/2006/main">
+              <a:graphicData uri="http://schemas.openxmlformats.org/drawingml/2006/picture">
+                <pic:pic xmlns:pic="http://schemas.openxmlformats.org/drawingml/2006/picture">
+                  <pic:nvPicPr>
+                    <pic:cNvPr id="1" name=""/>
+                    <pic:cNvPicPr/>
+                  </pic:nvPicPr>
+                  <pic:blipFill>
+                    <a:blip r:embed="rId5"/>
+                    <a:stretch>
+                      <a:fillRect/>
+                    </a:stretch>
+                  </pic:blipFill>
+                  <pic:spPr>
+                    <a:xfrm>
+                      <a:off x="0" y="0"/>
+                      <a:ext cx="5943600" cy="3340735"/>
+                    </a:xfrm>
+                    <a:prstGeom prst="rect">
+                      <a:avLst/>
+                    </a:prstGeom>
+                  </pic:spPr>
+                </pic:pic>
+              </a:graphicData>
+            </a:graphic>
+          </wp:inline>
+        </w:drawing>
+      </w:r>
     </w:p>
     <w:sectPr>
       <w:pgSz w:w="12240" w:h="15840"/>
@@ -54,7 +94,7 @@
 </file>
 
 <file path=word/styles.xml><?xml version="1.0" encoding="utf-8"?>
-<w:styles xmlns:mc="http://schemas.openxmlformats.org/markup-compatibility/2006" xmlns:r="http://schemas.openxmlformats.org/officeDocument/2006/relationships" xmlns:w="http://schemas.openxmlformats.org/wordprocessingml/2006/main" xmlns:w14="http://schemas.microsoft.com/office/word/2010/wordml" xmlns:w15="http://schemas.microsoft.com/office/word/2012/wordml" mc:Ignorable="w14 w15">
+<w:styles xmlns:mc="http://schemas.openxmlformats.org/markup-compatibility/2006" xmlns:r="http://schemas.openxmlformats.org/officeDocument/2006/relationships" xmlns:w="http://schemas.openxmlformats.org/wordprocessingml/2006/main" xmlns:w14="http://schemas.microsoft.com/office/word/2010/wordml" xmlns:w15="http://schemas.microsoft.com/office/word/2012/wordml" xmlns:w16se="http://schemas.microsoft.com/office/word/2015/wordml/symex" mc:Ignorable="w14 w15 w16se">
   <w:docDefaults>
     <w:rPrDefault>
       <w:rPr>

</xml_diff>